<commit_message>
[PLAN-app-viajes] Fase 1: interfaz, asistente e itinerario con datos de ejemplo
- App Next.js en apps/viajes (Rumbo): portada, asistente de 7 pasos y página del viaje
- Itinerario día por día con clima, actividades según el clima, vuelos, hoteles,
  condiciones, fuente/hora de cada precio y estado verificado/estimado/no verificado
- Ruta sugerida cuando se pone solo el país; total, por persona y aviso de presupuesto
- 10 tests de la lógica (reparto de días, clima, presupuesto)

Plan: docs/plans/PLAN-app-viajes-2026-10-26/PLAN-MASTER.md

Co-Authored-By: Claude Opus 5.5 <noreply@anthropic.com>
Claude-Session: https://claude.ai/code/session_01C5FhLk8CVsi38frpC3KgcW
</commit_message>
<xml_diff>
--- a/docs/plans/PLAN-app-viajes-2026-10-26/PLAN-MASTER.docx
+++ b/docs/plans/PLAN-app-viajes-2026-10-26/PLAN-MASTER.docx
@@ -51,7 +51,7 @@
         <w:rPr>
           <w:sz w:val="21"/>
         </w:rPr>
-        <w:t>status: planning</w:t>
+        <w:t>status: in-progress</w:t>
       </w:r>
     </w:p>
     <w:p>
@@ -117,13 +117,27 @@
           <w:b/>
           <w:color w:val="4A3F8C"/>
         </w:rPr>
-        <w:t>propuesta, esperando el OK del usuario</w:t>
+        <w:t>fase 1 lista, esperando revisión del usuario</w:t>
       </w:r>
       <w:r>
         <w:rPr>
           <w:color w:val="4A3F8C"/>
         </w:rPr>
-        <w:t>. No se escribe código hasta recibirlo.</w:t>
+        <w:t xml:space="preserve">. Código en </w:t>
+      </w:r>
+      <w:r>
+        <w:rPr>
+          <w:rFonts w:ascii="Courier New" w:hAnsi="Courier New"/>
+          <w:color w:val="F05922"/>
+          <w:sz w:val="18"/>
+        </w:rPr>
+        <w:t>apps/viajes/</w:t>
+      </w:r>
+      <w:r>
+        <w:rPr>
+          <w:color w:val="4A3F8C"/>
+        </w:rPr>
+        <w:t>.</w:t>
       </w:r>
     </w:p>
     <w:p>
@@ -2922,7 +2936,7 @@
               <w:rPr>
                 <w:sz w:val="20"/>
               </w:rPr>
-              <w:t>⬜</w:t>
+              <w:t>✅</w:t>
             </w:r>
           </w:p>
         </w:tc>
@@ -2942,7 +2956,7 @@
               <w:rPr>
                 <w:sz w:val="20"/>
               </w:rPr>
-              <w:t>-</w:t>
+              <w:t>2026-10-26</w:t>
             </w:r>
           </w:p>
         </w:tc>
@@ -3001,7 +3015,7 @@
               <w:rPr>
                 <w:sz w:val="20"/>
               </w:rPr>
-              <w:t>⬜</w:t>
+              <w:t>✅</w:t>
             </w:r>
           </w:p>
         </w:tc>
@@ -3020,7 +3034,7 @@
               <w:rPr>
                 <w:sz w:val="20"/>
               </w:rPr>
-              <w:t>-</w:t>
+              <w:t>2026-10-26</w:t>
             </w:r>
           </w:p>
         </w:tc>
@@ -3082,7 +3096,7 @@
               <w:rPr>
                 <w:sz w:val="20"/>
               </w:rPr>
-              <w:t>⬜</w:t>
+              <w:t>✅</w:t>
             </w:r>
           </w:p>
         </w:tc>
@@ -3102,7 +3116,7 @@
               <w:rPr>
                 <w:sz w:val="20"/>
               </w:rPr>
-              <w:t>-</w:t>
+              <w:t>2026-10-26</w:t>
             </w:r>
           </w:p>
         </w:tc>
@@ -3161,7 +3175,7 @@
               <w:rPr>
                 <w:sz w:val="20"/>
               </w:rPr>
-              <w:t>⬜</w:t>
+              <w:t>✅</w:t>
             </w:r>
           </w:p>
         </w:tc>
@@ -3180,7 +3194,7 @@
               <w:rPr>
                 <w:sz w:val="20"/>
               </w:rPr>
-              <w:t>-</w:t>
+              <w:t>2026-10-26</w:t>
             </w:r>
           </w:p>
         </w:tc>
@@ -5296,7 +5310,18 @@
           <w:color w:val="F05922"/>
           <w:sz w:val="28"/>
         </w:rPr>
-        <w:t>Decisiones pendientes del usuario</w:t>
+        <w:t>Decisiones (2026-10-26)</w:t>
+      </w:r>
+    </w:p>
+    <w:p>
+      <w:pPr>
+        <w:spacing w:after="80"/>
+      </w:pPr>
+      <w:r>
+        <w:rPr>
+          <w:sz w:val="21"/>
+        </w:rPr>
+        <w:t>El usuario delegó las decisiones ("hacé lo mejor para que sea profesional y que la gente la use"):</w:t>
       </w:r>
     </w:p>
     <w:p>
@@ -5315,7 +5340,7 @@
         <w:rPr>
           <w:sz w:val="21"/>
         </w:rPr>
-        <w:t>OK al stack y al plan.</w:t>
+        <w:t>Stack y plan: aprobados.</w:t>
       </w:r>
     </w:p>
     <w:p>
@@ -5334,7 +5359,21 @@
         <w:rPr>
           <w:sz w:val="21"/>
         </w:rPr>
-        <w:t>Dónde vive el código (repo nuevo recomendado vs. carpeta en este repo).</w:t>
+        <w:t xml:space="preserve">Código: carpeta </w:t>
+      </w:r>
+      <w:r>
+        <w:rPr>
+          <w:rFonts w:ascii="Courier New" w:hAnsi="Courier New"/>
+          <w:color w:val="F05922"/>
+          <w:sz w:val="21"/>
+        </w:rPr>
+        <w:t>apps/viajes/</w:t>
+      </w:r>
+      <w:r>
+        <w:rPr>
+          <w:sz w:val="21"/>
+        </w:rPr>
+        <w:t xml:space="preserve"> en este repo (se puede mover a un repo propio antes del deploy).</w:t>
       </w:r>
     </w:p>
     <w:p>
@@ -5353,7 +5392,37 @@
         <w:rPr>
           <w:sz w:val="21"/>
         </w:rPr>
-        <w:t>Uso comercial o personal (afecta Open-Meteo y los cupos gratis).</w:t>
+        <w:t>Uso: público/comercial. Antes de publicar (fase 6) hay que pasar a planes que permitan uso comercial</w:t>
+      </w:r>
+    </w:p>
+    <w:p>
+      <w:pPr>
+        <w:spacing w:after="80"/>
+      </w:pPr>
+      <w:r>
+        <w:rPr>
+          <w:sz w:val="21"/>
+        </w:rPr>
+        <w:t>(Open-Meteo comercial u OpenWeather como fuente principal; cupo pago de SerpApi).</w:t>
+      </w:r>
+    </w:p>
+    <w:p>
+      <w:pPr>
+        <w:spacing w:after="20"/>
+        <w:ind w:left="567" w:hanging="283"/>
+      </w:pPr>
+      <w:r>
+        <w:rPr>
+          <w:sz w:val="21"/>
+        </w:rPr>
+        <w:t>4.</w:t>
+        <w:tab/>
+      </w:r>
+      <w:r>
+        <w:rPr>
+          <w:sz w:val="21"/>
+        </w:rPr>
+        <w:t>Nombre de la app: Rumbo. Diseño: neutros zinc + acento teal, Geist, modo claro y oscuro automático.</w:t>
       </w:r>
     </w:p>
     <w:p>
@@ -5503,6 +5572,46 @@
                 <w:sz w:val="20"/>
               </w:rPr>
               <w:t>Propuesta inicial: investigación de APIs, stack y plan por fases</w:t>
+            </w:r>
+          </w:p>
+        </w:tc>
+      </w:tr>
+      <w:tr>
+        <w:tc>
+          <w:tcPr>
+            <w:tcW w:type="dxa" w:w="4844"/>
+            <w:tcBorders>
+              <w:top w:val="single" w:sz="4" w:space="0" w:color="CBCBCB"/>
+              <w:left w:val="single" w:sz="4" w:space="0" w:color="CBCBCB"/>
+              <w:bottom w:val="single" w:sz="4" w:space="0" w:color="CBCBCB"/>
+              <w:right w:val="single" w:sz="4" w:space="0" w:color="CBCBCB"/>
+            </w:tcBorders>
+          </w:tcPr>
+          <w:p>
+            <w:r>
+              <w:rPr>
+                <w:sz w:val="20"/>
+              </w:rPr>
+              <w:t>2026-10-26</w:t>
+            </w:r>
+          </w:p>
+        </w:tc>
+        <w:tc>
+          <w:tcPr>
+            <w:tcW w:type="dxa" w:w="4844"/>
+            <w:tcBorders>
+              <w:top w:val="single" w:sz="4" w:space="0" w:color="CBCBCB"/>
+              <w:left w:val="single" w:sz="4" w:space="0" w:color="CBCBCB"/>
+              <w:bottom w:val="single" w:sz="4" w:space="0" w:color="CBCBCB"/>
+              <w:right w:val="single" w:sz="4" w:space="0" w:color="CBCBCB"/>
+            </w:tcBorders>
+          </w:tcPr>
+          <w:p>
+            <w:r>
+              <w:rPr>
+                <w:sz w:val="20"/>
+              </w:rPr>
+              <w:t>Fase 1 completa: portada, asistente de 7 pasos, itinerario con datos de ejemplo, 10 tests</w:t>
             </w:r>
           </w:p>
         </w:tc>

</xml_diff>

<commit_message>
[PLAN-app-viajes] Publicación en Vercel (rumbotraveling.com)
- .vercelignore: solo se sube apps/viajes al publicar desde la raíz
- Ignorar .vercel y .env.local (credenciales locales de Vercel)
- Plan actualizado con la publicación

Co-Authored-By: Claude Opus 5.5 <noreply@anthropic.com>
Claude-Session: https://claude.ai/code/session_01C5FhLk8CVsi38frpC3KgcW
</commit_message>
<xml_diff>
--- a/docs/plans/PLAN-app-viajes-2026-10-26/PLAN-MASTER.docx
+++ b/docs/plans/PLAN-app-viajes-2026-10-26/PLAN-MASTER.docx
@@ -5611,6 +5611,76 @@
               <w:rPr>
                 <w:sz w:val="20"/>
               </w:rPr>
+              <w:t xml:space="preserve">Publicada en https://rumbotraveling.com (Vercel, proyecto </w:t>
+            </w:r>
+            <w:r>
+              <w:rPr>
+                <w:rFonts w:ascii="Courier New" w:hAnsi="Courier New"/>
+                <w:color w:val="F05922"/>
+                <w:sz w:val="20"/>
+              </w:rPr>
+              <w:t>rumbo</w:t>
+            </w:r>
+            <w:r>
+              <w:rPr>
+                <w:sz w:val="20"/>
+              </w:rPr>
+              <w:t xml:space="preserve">, carpeta </w:t>
+            </w:r>
+            <w:r>
+              <w:rPr>
+                <w:rFonts w:ascii="Courier New" w:hAnsi="Courier New"/>
+                <w:color w:val="F05922"/>
+                <w:sz w:val="20"/>
+              </w:rPr>
+              <w:t>apps/viajes</w:t>
+            </w:r>
+            <w:r>
+              <w:rPr>
+                <w:sz w:val="20"/>
+              </w:rPr>
+              <w:t>). Dominio comprado por el usuario, vence 26-oct-2027 con renovación automática</w:t>
+            </w:r>
+          </w:p>
+        </w:tc>
+      </w:tr>
+      <w:tr>
+        <w:tc>
+          <w:tcPr>
+            <w:tcW w:type="dxa" w:w="4844"/>
+            <w:shd w:val="clear" w:color="auto" w:fill="B8B3D6"/>
+            <w:tcBorders>
+              <w:top w:val="single" w:sz="4" w:space="0" w:color="CBCBCB"/>
+              <w:left w:val="single" w:sz="4" w:space="0" w:color="CBCBCB"/>
+              <w:bottom w:val="single" w:sz="4" w:space="0" w:color="CBCBCB"/>
+              <w:right w:val="single" w:sz="4" w:space="0" w:color="CBCBCB"/>
+            </w:tcBorders>
+          </w:tcPr>
+          <w:p>
+            <w:r>
+              <w:rPr>
+                <w:sz w:val="20"/>
+              </w:rPr>
+              <w:t>2026-10-26</w:t>
+            </w:r>
+          </w:p>
+        </w:tc>
+        <w:tc>
+          <w:tcPr>
+            <w:tcW w:type="dxa" w:w="4844"/>
+            <w:shd w:val="clear" w:color="auto" w:fill="B8B3D6"/>
+            <w:tcBorders>
+              <w:top w:val="single" w:sz="4" w:space="0" w:color="CBCBCB"/>
+              <w:left w:val="single" w:sz="4" w:space="0" w:color="CBCBCB"/>
+              <w:bottom w:val="single" w:sz="4" w:space="0" w:color="CBCBCB"/>
+              <w:right w:val="single" w:sz="4" w:space="0" w:color="CBCBCB"/>
+            </w:tcBorders>
+          </w:tcPr>
+          <w:p>
+            <w:r>
+              <w:rPr>
+                <w:sz w:val="20"/>
+              </w:rPr>
               <w:t>Fase 1 completa: portada, asistente de 7 pasos, itinerario con datos de ejemplo, 10 tests</w:t>
             </w:r>
           </w:p>

</xml_diff>